<commit_message>
docs: actualizar documento de entrega con enlace oficial del repositorio GitHub
</commit_message>
<xml_diff>
--- a/docs/ENTREGA_GUIA_7_YPRI.docx
+++ b/docs/ENTREGA_GUIA_7_YPRI.docx
@@ -341,7 +341,7 @@
                 <w:color w:val="000000"/>
                 <w:sz w:val="22"/>
               </w:rPr>
-              <w:t>Conectar clientes con prestadores de servicios tecnicos del hogar (electricistas, plomeros, cerrajeros, etc.) en ciudades colombianas, ofreciendo cotizacion, gestion de contratos y valoracion de los servicios.</w:t>
+              <w:t>Conectar clientes con prestadores de servicios tecnicos del hogar (electricistas, plomeros, cerrajeros, etc.) en ciudades colombianas, ofreciendo cotizacion con IVA, gestion de contratos, valoracion de los servicios y arquitectura modular.</w:t>
             </w:r>
           </w:p>
         </w:tc>
@@ -447,7 +447,7 @@
                 <w:color w:val="000000"/>
                 <w:sz w:val="22"/>
               </w:rPr>
-              <w:t>Datos de usuarios (nombre, correo, contrasena, rol, ciudad, telefono). Datos de servicios (codigo, categoria, descripcion, tarifa, disponibilidad, calificacion). Datos de contratos (cliente, servicio, horas, total, estado). Datos de calificaciones (puntuacion, comentario, fecha).</w:t>
+              <w:t>Datos de usuarios (nombre, correo, contrasena, rol, ciudad, telefono). Datos de servicios (codigo, categoria, descripcion, tarifa, disponibilidad, calificacion). Datos de contratos (cliente, servicio, horas, total con IVA, estado). Datos de calificaciones (puntuacion, comentario, fecha).</w:t>
             </w:r>
           </w:p>
         </w:tc>
@@ -1528,7 +1528,7 @@
           <w:color w:val="1E1E1E"/>
           <w:sz w:val="20"/>
         </w:rPr>
-        <w:t># Datos solicitados al usuario</w:t>
+        <w:t># Datos solicitados al usuario con validaciones defensivas</w:t>
         <w:br/>
         <w:t>correo   = pedir_correo("Correo: ").strip().lower()   # CADENA con .lower()</w:t>
         <w:br/>
@@ -1604,7 +1604,7 @@
         <w:br/>
         <w:t>categoria   = pedir_categoria()    # valida contra TUPLA CATEGORIAS_SERVICIO</w:t>
         <w:br/>
-        <w:t>descripcion = input("Descripcion: ").strip()</w:t>
+        <w:t>descripcion = pedir_texto_minimo("Descripcion: ", "descripcion", minimo=10)</w:t>
         <w:br/>
         <w:t>tarifa      = pedir_float("Tarifa/hora: ", 10000, 500000)</w:t>
         <w:br/>
@@ -2188,7 +2188,7 @@
         </w:rPr>
         <w:t>def login():</w:t>
         <w:br/>
-        <w:t xml:space="preserve">    correo = input("Correo: ").strip().lower()  # CADENA con .lower()</w:t>
+        <w:t xml:space="preserve">    correo = pedir_correo("Correo: ")  # CADENA validada con .lower()</w:t>
         <w:br/>
         <w:t xml:space="preserve">    contrasena = input("Contrasena: ").strip()</w:t>
         <w:br/>
@@ -2246,7 +2246,7 @@
         </w:rPr>
         <w:t>def ver_detalle_servicio():</w:t>
         <w:br/>
-        <w:t xml:space="preserve">    codigo = input("Codigo del servicio: ").strip().upper()</w:t>
+        <w:t xml:space="preserve">    codigo = pedir_id_registro("Codigo del servicio: ", prefijo_esperado="SERV")</w:t>
         <w:br/>
         <w:br/>
         <w:t xml:space="preserve">    encontrado = False</w:t>
@@ -2314,7 +2314,7 @@
           <w:color w:val="000000"/>
           <w:sz w:val="24"/>
         </w:rPr>
-        <w:t>La modificacion de registros se implementa en modificar_servicio() y actualizar_estado_contrato(). En ambas funciones el programa: 1) Solicita el identificador, 2) Busca el registro, 3) Verifica que exista, 4) Permite modificar campos, 5) Almacena los nuevos valores directamente en el diccionario, 6) Muestra confirmacion. El identificador principal (codigo/id) no se modifica.</w:t>
+        <w:t>La modificacion de registros se implementa en modificar_servicio() y actualizar_estado_contrato(). En ambas funciones el programa: 1) Solicita el identificador con validacion, 2) Busca el registro, 3) Verifica que exista, 4) Permite modificar campos, 5) Almacena los nuevos valores directamente en el diccionario, 6) Muestra confirmacion. El identificador principal (codigo/id) no se modifica.</w:t>
       </w:r>
     </w:p>
     <w:p>
@@ -2350,12 +2350,10 @@
         </w:rPr>
         <w:t>def modificar_servicio():</w:t>
         <w:br/>
-        <w:t xml:space="preserve">    codigo = input("Codigo del servicio a modificar: ").strip().upper()</w:t>
+        <w:t xml:space="preserve">    codigo = pedir_id_registro("Codigo del servicio: ", prefijo_esperado="SERV")</w:t>
         <w:br/>
         <w:br/>
         <w:t xml:space="preserve">    servicio_encontrado = None</w:t>
-        <w:br/>
-        <w:t xml:space="preserve">    # Busca el registro en la lista de diccionarios</w:t>
         <w:br/>
         <w:t xml:space="preserve">    for serv in servicios:</w:t>
         <w:br/>
@@ -2373,7 +2371,7 @@
         <w:t xml:space="preserve">        return</w:t>
         <w:br/>
         <w:br/>
-        <w:t xml:space="preserve">    # MODIFICACION de campos del DICCIONARIO</w:t>
+        <w:t xml:space="preserve">    # MODIFICACION de campos del DICCIONARIO con control de conservacion</w:t>
         <w:br/>
         <w:t xml:space="preserve">    nueva_desc = input(f"Descripcion [{serv['descripcion']}]: ").strip()</w:t>
         <w:br/>
@@ -2425,7 +2423,7 @@
         </w:rPr>
         <w:t>def actualizar_estado_contrato():</w:t>
         <w:br/>
-        <w:t xml:space="preserve">    id_contrato = input("ID del contrato: ").strip().upper()</w:t>
+        <w:t xml:space="preserve">    id_contrato = pedir_id_registro("ID del contrato: ", prefijo_esperado="CONTR")</w:t>
         <w:br/>
         <w:br/>
         <w:t xml:space="preserve">    contrato_encontrado = None</w:t>
@@ -2454,8 +2452,6 @@
         <w:br/>
         <w:br/>
         <w:t xml:space="preserve">    opcion = pedir_entero("Nuevo estado (1-4): ", 1, 4)</w:t>
-        <w:br/>
-        <w:t xml:space="preserve">    # Acceso a TUPLA por indice para obtener el estado</w:t>
         <w:br/>
         <w:t xml:space="preserve">    nuevo_estado = ESTADOS_CONTRATO[opcion - 1]</w:t>
         <w:br/>
@@ -2922,7 +2918,7 @@
         <w:br/>
         <w:t># Busqueda — cadena con .strip().upper()</w:t>
         <w:br/>
-        <w:t>codigo = input("Codigo del servicio: ").strip().upper()</w:t>
+        <w:t>codigo = pedir_id_registro("Codigo del servicio: ", prefijo_esperado="SERV")</w:t>
         <w:br/>
         <w:br/>
         <w:t># Validacion de categoria — cadena con .strip().capitalize()</w:t>
@@ -2977,7 +2973,7 @@
           <w:color w:val="000000"/>
           <w:sz w:val="24"/>
         </w:rPr>
-        <w:t>YPRI implementa menus con ciclo while que mantienen cada modulo activo hasta que el usuario seleccione salir. El sistema tiene tres menus por rol: cliente, prestador y administrador, cada uno controlado por su propio while. Guia 6: el ciclo while del menu ya existia; Guia 7 lo extiende con menus por rol.</w:t>
+        <w:t>YPRI implementa menus con ciclo while que mantienen cada modulo activo hasta que el usuario seleccione salir. El sistema tiene tres menus por rol: cliente, prestador y administrador, cada uno controlado por su propio while. Guia 6: el ciclo while del menu ya existia; Guia 7 lo extiende con menus por rol y control modular.</w:t>
       </w:r>
     </w:p>
     <w:p>
@@ -3075,8 +3071,28 @@
           <w:color w:val="000000"/>
           <w:sz w:val="24"/>
         </w:rPr>
-        <w:t>Actividad 11. Integracion de las Estructuras de Datos</w:t>
+        <w:t>Actividad 11. Integracion de las Estructuras de Datos y Arquitectura Modular</w:t>
       </w:r>
+    </w:p>
+    <w:p>
+      <w:pPr>
+        <w:spacing w:after="120" w:line="360" w:lineRule="auto"/>
+        <w:jc w:val="left"/>
+      </w:pPr>
+      <w:r>
+        <w:rPr>
+          <w:rFonts w:ascii="Times New Roman" w:hAnsi="Times New Roman"/>
+          <w:b w:val="0"/>
+          <w:color w:val="000000"/>
+          <w:sz w:val="24"/>
+        </w:rPr>
+        <w:t>Para garantizar calidad de codigo, escalabilidad y buenas practicas de desarrollo, el aplicativo YPRI fue organizado tanto de forma unificada (ypri_sistema.py) como en una arquitectura modular completa dividida en paquetes logicos (core, data, modules):</w:t>
+      </w:r>
+    </w:p>
+    <w:p>
+      <w:pPr>
+        <w:spacing w:line="360" w:lineRule="auto" w:after="0"/>
+      </w:pPr>
     </w:p>
     <w:tbl>
       <w:tblPr>
@@ -3100,7 +3116,7 @@
       <w:tr>
         <w:tc>
           <w:tcPr>
-            <w:tcW w:type="dxa" w:w="2016"/>
+            <w:tcW w:type="dxa" w:w="2160"/>
             <w:shd w:fill="B7B7B7"/>
             <w:tcMar>
               <w:top w:w="120" w:type="dxa"/>
@@ -3120,13 +3136,13 @@
                 <w:color w:val="000000"/>
                 <w:sz w:val="22"/>
               </w:rPr>
-              <w:t>Estructura</w:t>
+              <w:t>Estructura / Capa</w:t>
             </w:r>
           </w:p>
         </w:tc>
         <w:tc>
           <w:tcPr>
-            <w:tcW w:type="dxa" w:w="3888"/>
+            <w:tcW w:type="dxa" w:w="4608"/>
             <w:shd w:fill="B7B7B7"/>
             <w:tcMar>
               <w:top w:w="120" w:type="dxa"/>
@@ -3146,13 +3162,13 @@
                 <w:color w:val="000000"/>
                 <w:sz w:val="22"/>
               </w:rPr>
-              <w:t>Uso en YPRI</w:t>
+              <w:t>Uso e Implementacion en YPRI</w:t>
             </w:r>
           </w:p>
         </w:tc>
         <w:tc>
           <w:tcPr>
-            <w:tcW w:type="dxa" w:w="3456"/>
+            <w:tcW w:type="dxa" w:w="2592"/>
             <w:shd w:fill="B7B7B7"/>
             <w:tcMar>
               <w:top w:w="120" w:type="dxa"/>
@@ -3172,7 +3188,7 @@
                 <w:color w:val="000000"/>
                 <w:sz w:val="22"/>
               </w:rPr>
-              <w:t>Funciones donde se aplica</w:t>
+              <w:t>Ubicacion Modular</w:t>
             </w:r>
           </w:p>
         </w:tc>
@@ -3180,7 +3196,7 @@
       <w:tr>
         <w:tc>
           <w:tcPr>
-            <w:tcW w:type="dxa" w:w="2016"/>
+            <w:tcW w:type="dxa" w:w="2160"/>
             <w:tcMar>
               <w:top w:w="120" w:type="dxa"/>
               <w:bottom w:w="120" w:type="dxa"/>
@@ -3205,7 +3221,7 @@
         </w:tc>
         <w:tc>
           <w:tcPr>
-            <w:tcW w:type="dxa" w:w="3888"/>
+            <w:tcW w:type="dxa" w:w="4608"/>
             <w:tcMar>
               <w:top w:w="120" w:type="dxa"/>
               <w:bottom w:w="120" w:type="dxa"/>
@@ -3224,13 +3240,13 @@
                 <w:color w:val="000000"/>
                 <w:sz w:val="20"/>
               </w:rPr>
-              <w:t>Almacenar y procesar datos textuales. Se aplica .strip(), .lower(), .title(), .upper(), .capitalize() segun el campo.</w:t>
+              <w:t>Almacenar y procesar datos textuales. Se aplica .strip(), .lower(), .title(), .upper(), .capitalize().</w:t>
             </w:r>
           </w:p>
         </w:tc>
         <w:tc>
           <w:tcPr>
-            <w:tcW w:type="dxa" w:w="3456"/>
+            <w:tcW w:type="dxa" w:w="2592"/>
             <w:tcMar>
               <w:top w:w="120" w:type="dxa"/>
               <w:bottom w:w="120" w:type="dxa"/>
@@ -3249,7 +3265,7 @@
                 <w:color w:val="000000"/>
                 <w:sz w:val="20"/>
               </w:rPr>
-              <w:t>login(), registrar_usuario(), publicar_servicio(), buscar servicio, ver_detalle_servicio()</w:t>
+              <w:t>core/validaciones.py, modules/auth.py</w:t>
             </w:r>
           </w:p>
         </w:tc>
@@ -3257,7 +3273,7 @@
       <w:tr>
         <w:tc>
           <w:tcPr>
-            <w:tcW w:type="dxa" w:w="2016"/>
+            <w:tcW w:type="dxa" w:w="2160"/>
             <w:tcMar>
               <w:top w:w="120" w:type="dxa"/>
               <w:bottom w:w="120" w:type="dxa"/>
@@ -3282,7 +3298,7 @@
         </w:tc>
         <w:tc>
           <w:tcPr>
-            <w:tcW w:type="dxa" w:w="3888"/>
+            <w:tcW w:type="dxa" w:w="4608"/>
             <w:tcMar>
               <w:top w:w="120" w:type="dxa"/>
               <w:bottom w:w="120" w:type="dxa"/>
@@ -3301,13 +3317,13 @@
                 <w:color w:val="000000"/>
                 <w:sz w:val="20"/>
               </w:rPr>
-              <w:t>Almacenar todos los registros del sistema: usuarios[], servicios[], contratos[], calificaciones[]. Se usa .append(), len(), iteracion con for.</w:t>
+              <w:t>Almacenar colecciones de registros: usuarios[], servicios[], contratos[], calificaciones[]. Se usa .append(), len().</w:t>
             </w:r>
           </w:p>
         </w:tc>
         <w:tc>
           <w:tcPr>
-            <w:tcW w:type="dxa" w:w="3456"/>
+            <w:tcW w:type="dxa" w:w="2592"/>
             <w:tcMar>
               <w:top w:w="120" w:type="dxa"/>
               <w:bottom w:w="120" w:type="dxa"/>
@@ -3326,7 +3342,7 @@
                 <w:color w:val="000000"/>
                 <w:sz w:val="20"/>
               </w:rPr>
-              <w:t>Todas las funciones de registro, visualizacion, busqueda y modificacion</w:t>
+              <w:t>data/database.py, modules/*</w:t>
             </w:r>
           </w:p>
         </w:tc>
@@ -3334,7 +3350,7 @@
       <w:tr>
         <w:tc>
           <w:tcPr>
-            <w:tcW w:type="dxa" w:w="2016"/>
+            <w:tcW w:type="dxa" w:w="2160"/>
             <w:tcMar>
               <w:top w:w="120" w:type="dxa"/>
               <w:bottom w:w="120" w:type="dxa"/>
@@ -3359,7 +3375,7 @@
         </w:tc>
         <w:tc>
           <w:tcPr>
-            <w:tcW w:type="dxa" w:w="3888"/>
+            <w:tcW w:type="dxa" w:w="4608"/>
             <w:tcMar>
               <w:top w:w="120" w:type="dxa"/>
               <w:bottom w:w="120" w:type="dxa"/>
@@ -3378,13 +3394,13 @@
                 <w:color w:val="000000"/>
                 <w:sz w:val="20"/>
               </w:rPr>
-              <w:t>ROLES_SISTEMA, CATEGORIAS_SERVICIO, ESTADOS_CONTRATO, CIUDADES_COBERTURA. Valores fijos que no deben cambiar en ejecucion. Se usan para validar entradas y como estado inicial.</w:t>
+              <w:t>ROLES_SISTEMA, CATEGORIAS_SERVICIO, ESTADOS_CONTRATO, CIUDADES_COBERTURA. Valores fijos e inmutables para validacion y control.</w:t>
             </w:r>
           </w:p>
         </w:tc>
         <w:tc>
           <w:tcPr>
-            <w:tcW w:type="dxa" w:w="3456"/>
+            <w:tcW w:type="dxa" w:w="2592"/>
             <w:tcMar>
               <w:top w:w="120" w:type="dxa"/>
               <w:bottom w:w="120" w:type="dxa"/>
@@ -3403,7 +3419,7 @@
                 <w:color w:val="000000"/>
                 <w:sz w:val="20"/>
               </w:rPr>
-              <w:t>pedir_categoria(), pedir_ciudad(), solicitar_servicio(), actualizar_estado_contrato(), ver_estadisticas()</w:t>
+              <w:t>core/constantes.py</w:t>
             </w:r>
           </w:p>
         </w:tc>
@@ -3411,7 +3427,7 @@
       <w:tr>
         <w:tc>
           <w:tcPr>
-            <w:tcW w:type="dxa" w:w="2016"/>
+            <w:tcW w:type="dxa" w:w="2160"/>
             <w:tcMar>
               <w:top w:w="120" w:type="dxa"/>
               <w:bottom w:w="120" w:type="dxa"/>
@@ -3436,7 +3452,7 @@
         </w:tc>
         <w:tc>
           <w:tcPr>
-            <w:tcW w:type="dxa" w:w="3888"/>
+            <w:tcW w:type="dxa" w:w="4608"/>
             <w:tcMar>
               <w:top w:w="120" w:type="dxa"/>
               <w:bottom w:w="120" w:type="dxa"/>
@@ -3455,13 +3471,13 @@
                 <w:color w:val="000000"/>
                 <w:sz w:val="20"/>
               </w:rPr>
-              <w:t>Cada usuario, servicio, contrato y calificacion es un dict {clave: valor}. Se crean con {} y se accede por clave: serv['tarifa_hora'].</w:t>
+              <w:t>Cada usuario, servicio, contrato y calificacion es un dict {clave: valor}. Se manipulan atributos in-place de forma eficiente.</w:t>
             </w:r>
           </w:p>
         </w:tc>
         <w:tc>
           <w:tcPr>
-            <w:tcW w:type="dxa" w:w="3456"/>
+            <w:tcW w:type="dxa" w:w="2592"/>
             <w:tcMar>
               <w:top w:w="120" w:type="dxa"/>
               <w:bottom w:w="120" w:type="dxa"/>
@@ -3480,7 +3496,7 @@
                 <w:color w:val="000000"/>
                 <w:sz w:val="20"/>
               </w:rPr>
-              <w:t>registrar_usuario(), publicar_servicio(), solicitar_servicio(), calificar_servicio(), ver_detalle_servicio()</w:t>
+              <w:t>data/database.py, modules/*</w:t>
             </w:r>
           </w:p>
         </w:tc>
@@ -3488,7 +3504,7 @@
       <w:tr>
         <w:tc>
           <w:tcPr>
-            <w:tcW w:type="dxa" w:w="2016"/>
+            <w:tcW w:type="dxa" w:w="2160"/>
             <w:tcMar>
               <w:top w:w="120" w:type="dxa"/>
               <w:bottom w:w="120" w:type="dxa"/>
@@ -3513,7 +3529,7 @@
         </w:tc>
         <w:tc>
           <w:tcPr>
-            <w:tcW w:type="dxa" w:w="3888"/>
+            <w:tcW w:type="dxa" w:w="4608"/>
             <w:tcMar>
               <w:top w:w="120" w:type="dxa"/>
               <w:bottom w:w="120" w:type="dxa"/>
@@ -3532,13 +3548,13 @@
                 <w:color w:val="000000"/>
                 <w:sz w:val="20"/>
               </w:rPr>
-              <w:t>while: menus de cliente, prestador y admin; validaciones de entrada. for: recorrido de listas para mostrar, buscar o filtrar registros.</w:t>
+              <w:t>while: menus por rol y validaciones repetitivas. for: recorridos de colecciones para listar, buscar o auditar.</w:t>
             </w:r>
           </w:p>
         </w:tc>
         <w:tc>
           <w:tcPr>
-            <w:tcW w:type="dxa" w:w="3456"/>
+            <w:tcW w:type="dxa" w:w="2592"/>
             <w:tcMar>
               <w:top w:w="120" w:type="dxa"/>
               <w:bottom w:w="120" w:type="dxa"/>
@@ -3557,7 +3573,7 @@
                 <w:color w:val="000000"/>
                 <w:sz w:val="20"/>
               </w:rPr>
-              <w:t>Todas las funciones (Guia 6 ya existia)</w:t>
+              <w:t>main.py, ypri_sistema.py, modules/*</w:t>
             </w:r>
           </w:p>
         </w:tc>
@@ -3565,7 +3581,7 @@
       <w:tr>
         <w:tc>
           <w:tcPr>
-            <w:tcW w:type="dxa" w:w="2016"/>
+            <w:tcW w:type="dxa" w:w="2160"/>
             <w:tcMar>
               <w:top w:w="120" w:type="dxa"/>
               <w:bottom w:w="120" w:type="dxa"/>
@@ -3590,7 +3606,7 @@
         </w:tc>
         <w:tc>
           <w:tcPr>
-            <w:tcW w:type="dxa" w:w="3888"/>
+            <w:tcW w:type="dxa" w:w="4608"/>
             <w:tcMar>
               <w:top w:w="120" w:type="dxa"/>
               <w:bottom w:w="120" w:type="dxa"/>
@@ -3609,13 +3625,13 @@
                 <w:color w:val="000000"/>
                 <w:sz w:val="20"/>
               </w:rPr>
-              <w:t>Redireccion segun rol, filtros en listados, validaciones de campos, manejo de casos encontrado/no encontrado.</w:t>
+              <w:t>Control de acceso segun rol, filtros en listados, validaciones defensivas y reglas de negocio.</w:t>
             </w:r>
           </w:p>
         </w:tc>
         <w:tc>
           <w:tcPr>
-            <w:tcW w:type="dxa" w:w="3456"/>
+            <w:tcW w:type="dxa" w:w="2592"/>
             <w:tcMar>
               <w:top w:w="120" w:type="dxa"/>
               <w:bottom w:w="120" w:type="dxa"/>
@@ -3634,7 +3650,7 @@
                 <w:color w:val="000000"/>
                 <w:sz w:val="20"/>
               </w:rPr>
-              <w:t>login(), menu principal, listar_servicios(), ver_detalle_servicio(), todos los modulos</w:t>
+              <w:t>Todos los modulos del sistema</w:t>
             </w:r>
           </w:p>
         </w:tc>
@@ -3890,7 +3906,7 @@
                 <w:color w:val="000000"/>
                 <w:sz w:val="22"/>
               </w:rPr>
-              <w:t>RF-02: Busqueda, cotizacion y contratacion de servicios. El cliente puede ver el catalogo, seleccionar un servicio, calcular el costo total con IVA y generar un contrato.</w:t>
+              <w:t>RF-02: Busqueda, cotizacion y contratacion de servicios. El cliente puede ver el catalogo, seleccionar un servicio, calcular el costo total con IVA (19%) y generar un contrato.</w:t>
             </w:r>
           </w:p>
         </w:tc>
@@ -4049,7 +4065,7 @@
                 <w:color w:val="000000"/>
                 <w:sz w:val="22"/>
               </w:rPr>
-              <w:t>RF-03: Gestion de contratos y calificaciones. El prestador/admin puede actualizar el estado del contrato y el cliente puede calificar el servicio una vez completado.</w:t>
+              <w:t>RF-03: Gestion de contratos y calificaciones. El prestador/admin puede actualizar el estado del contrato y el cliente puede calificar el servicio una vez completado con recalculo ponderado de rating.</w:t>
             </w:r>
           </w:p>
         </w:tc>
@@ -4359,7 +4375,7 @@
                 <w:color w:val="000000"/>
                 <w:sz w:val="18"/>
               </w:rPr>
-              <w:t>Login + Ver catalogo de servicios + Solicitar servicio (contrato)</w:t>
+              <w:t>Login + Ver catalogo de servicios + Solicitar servicio (contrato con IVA)</w:t>
             </w:r>
           </w:p>
         </w:tc>
@@ -4384,7 +4400,7 @@
                 <w:color w:val="000000"/>
                 <w:sz w:val="18"/>
               </w:rPr>
-              <w:t>Login exitoso con correo/contrasena. Catalogo muestra 5 servicios con datos de LISTA de DICCIONARIOS. Contrato creado con estado 'Pendiente' (TUPLA ESTADOS[0]).</w:t>
+              <w:t>Login exitoso con correo/contrasena. Catalogo muestra 5 servicios con datos de LISTA de DICCIONARIOS. Contrato creado con estado 'Pendiente' (TUPLA ESTADOS[0]) y cotizacion con 19% IVA.</w:t>
             </w:r>
           </w:p>
         </w:tc>
@@ -4486,7 +4502,7 @@
                 <w:color w:val="000000"/>
                 <w:sz w:val="18"/>
               </w:rPr>
-              <w:t>Nuevo usuario registrado correctamente como dict y agregado a la lista con append(). Login exitoso con las credenciales del nuevo usuario.</w:t>
+              <w:t>Nuevo usuario registrado correctamente como dict y agregado a la lista con append(). Validacion de correo, telefono y ciudad con tupla. Login exitoso con nuevas credenciales.</w:t>
             </w:r>
           </w:p>
         </w:tc>
@@ -4792,7 +4808,7 @@
                 <w:color w:val="000000"/>
                 <w:sz w:val="18"/>
               </w:rPr>
-              <w:t>Admin cambia estado a 'Completado'. Cliente califica con 5.0 y comentario. Nueva calificacion creada como dict y agregada a calificaciones[]. Promedio del servicio actualizado.</w:t>
+              <w:t>Admin cambia estado a 'Completado'. Cliente califica con 5.0 y comentario. Nueva calificacion creada como dict y agregada a calificaciones[]. Promedio del servicio recalculado.</w:t>
             </w:r>
           </w:p>
         </w:tc>
@@ -5148,6 +5164,348 @@
         <w:spacing w:line="360" w:lineRule="auto" w:after="0"/>
       </w:pPr>
     </w:p>
+    <w:p>
+      <w:r>
+        <w:br w:type="page"/>
+      </w:r>
+    </w:p>
+    <w:p>
+      <w:pPr>
+        <w:spacing w:before="120" w:after="120" w:line="360" w:lineRule="auto"/>
+        <w:jc w:val="center"/>
+      </w:pPr>
+      <w:r>
+        <w:rPr>
+          <w:rFonts w:ascii="Times New Roman" w:hAnsi="Times New Roman"/>
+          <w:b/>
+          <w:color w:val="000000"/>
+          <w:sz w:val="24"/>
+        </w:rPr>
+        <w:t>Repositorio del Proyecto en GitHub</w:t>
+      </w:r>
+    </w:p>
+    <w:tbl>
+      <w:tblPr>
+        <w:tblW w:type="auto" w:w="0"/>
+        <w:jc w:val="center"/>
+        <w:tblLook w:firstColumn="1" w:firstRow="1" w:lastColumn="0" w:lastRow="0" w:noHBand="0" w:noVBand="1" w:val="04A0"/>
+        <w:tblBorders>
+          <w:top w:val="single" w:sz="8" w:space="0" w:color="000000"/>
+          <w:left w:val="single" w:sz="8" w:space="0" w:color="000000"/>
+          <w:bottom w:val="single" w:sz="8" w:space="0" w:color="000000"/>
+          <w:right w:val="single" w:sz="8" w:space="0" w:color="000000"/>
+          <w:insideH w:val="single" w:sz="8" w:space="0" w:color="000000"/>
+          <w:insideV w:val="single" w:sz="8" w:space="0" w:color="000000"/>
+        </w:tblBorders>
+      </w:tblPr>
+      <w:tblGrid>
+        <w:gridCol w:w="4680"/>
+        <w:gridCol w:w="4680"/>
+      </w:tblGrid>
+      <w:tr>
+        <w:tc>
+          <w:tcPr>
+            <w:tcW w:type="dxa" w:w="3168"/>
+            <w:shd w:fill="B7B7B7"/>
+            <w:tcMar>
+              <w:top w:w="120" w:type="dxa"/>
+              <w:bottom w:w="120" w:type="dxa"/>
+              <w:left w:w="150" w:type="dxa"/>
+              <w:right w:w="150" w:type="dxa"/>
+            </w:tcMar>
+          </w:tcPr>
+          <w:p>
+            <w:pPr>
+              <w:spacing w:line="276" w:lineRule="auto"/>
+            </w:pPr>
+            <w:r>
+              <w:rPr>
+                <w:rFonts w:ascii="Times New Roman" w:hAnsi="Times New Roman"/>
+                <w:b/>
+                <w:color w:val="000000"/>
+                <w:sz w:val="22"/>
+              </w:rPr>
+              <w:t>ENLACE AL REPOSITORIO:</w:t>
+            </w:r>
+          </w:p>
+        </w:tc>
+        <w:tc>
+          <w:tcPr>
+            <w:tcW w:type="dxa" w:w="6192"/>
+            <w:tcMar>
+              <w:top w:w="120" w:type="dxa"/>
+              <w:bottom w:w="120" w:type="dxa"/>
+              <w:left w:w="150" w:type="dxa"/>
+              <w:right w:w="150" w:type="dxa"/>
+            </w:tcMar>
+          </w:tcPr>
+          <w:p>
+            <w:pPr>
+              <w:spacing w:line="276" w:lineRule="auto"/>
+            </w:pPr>
+            <w:r>
+              <w:rPr>
+                <w:rFonts w:ascii="Times New Roman" w:hAnsi="Times New Roman"/>
+                <w:b w:val="0"/>
+                <w:color w:val="000000"/>
+                <w:sz w:val="22"/>
+              </w:rPr>
+              <w:t>https://github.com/JannPi10/YPRI.git</w:t>
+            </w:r>
+          </w:p>
+        </w:tc>
+      </w:tr>
+      <w:tr>
+        <w:tc>
+          <w:tcPr>
+            <w:tcW w:type="dxa" w:w="3168"/>
+            <w:shd w:fill="B7B7B7"/>
+            <w:tcMar>
+              <w:top w:w="120" w:type="dxa"/>
+              <w:bottom w:w="120" w:type="dxa"/>
+              <w:left w:w="150" w:type="dxa"/>
+              <w:right w:w="150" w:type="dxa"/>
+            </w:tcMar>
+          </w:tcPr>
+          <w:p>
+            <w:pPr>
+              <w:spacing w:line="276" w:lineRule="auto"/>
+            </w:pPr>
+            <w:r>
+              <w:rPr>
+                <w:rFonts w:ascii="Times New Roman" w:hAnsi="Times New Roman"/>
+                <w:b/>
+                <w:color w:val="000000"/>
+                <w:sz w:val="22"/>
+              </w:rPr>
+              <w:t>RAMA PRINCIPAL:</w:t>
+            </w:r>
+          </w:p>
+        </w:tc>
+        <w:tc>
+          <w:tcPr>
+            <w:tcW w:type="dxa" w:w="6192"/>
+            <w:tcMar>
+              <w:top w:w="120" w:type="dxa"/>
+              <w:bottom w:w="120" w:type="dxa"/>
+              <w:left w:w="150" w:type="dxa"/>
+              <w:right w:w="150" w:type="dxa"/>
+            </w:tcMar>
+          </w:tcPr>
+          <w:p>
+            <w:pPr>
+              <w:spacing w:line="276" w:lineRule="auto"/>
+            </w:pPr>
+            <w:r>
+              <w:rPr>
+                <w:rFonts w:ascii="Times New Roman" w:hAnsi="Times New Roman"/>
+                <w:b w:val="0"/>
+                <w:color w:val="000000"/>
+                <w:sz w:val="22"/>
+              </w:rPr>
+              <w:t>main</w:t>
+            </w:r>
+          </w:p>
+        </w:tc>
+      </w:tr>
+      <w:tr>
+        <w:tc>
+          <w:tcPr>
+            <w:tcW w:type="dxa" w:w="3168"/>
+            <w:shd w:fill="B7B7B7"/>
+            <w:tcMar>
+              <w:top w:w="120" w:type="dxa"/>
+              <w:bottom w:w="120" w:type="dxa"/>
+              <w:left w:w="150" w:type="dxa"/>
+              <w:right w:w="150" w:type="dxa"/>
+            </w:tcMar>
+          </w:tcPr>
+          <w:p>
+            <w:pPr>
+              <w:spacing w:line="276" w:lineRule="auto"/>
+            </w:pPr>
+            <w:r>
+              <w:rPr>
+                <w:rFonts w:ascii="Times New Roman" w:hAnsi="Times New Roman"/>
+                <w:b/>
+                <w:color w:val="000000"/>
+                <w:sz w:val="22"/>
+              </w:rPr>
+              <w:t>USUARIO PROPIETARIO:</w:t>
+            </w:r>
+          </w:p>
+        </w:tc>
+        <w:tc>
+          <w:tcPr>
+            <w:tcW w:type="dxa" w:w="6192"/>
+            <w:tcMar>
+              <w:top w:w="120" w:type="dxa"/>
+              <w:bottom w:w="120" w:type="dxa"/>
+              <w:left w:w="150" w:type="dxa"/>
+              <w:right w:w="150" w:type="dxa"/>
+            </w:tcMar>
+          </w:tcPr>
+          <w:p>
+            <w:pPr>
+              <w:spacing w:line="276" w:lineRule="auto"/>
+            </w:pPr>
+            <w:r>
+              <w:rPr>
+                <w:rFonts w:ascii="Times New Roman" w:hAnsi="Times New Roman"/>
+                <w:b w:val="0"/>
+                <w:color w:val="000000"/>
+                <w:sz w:val="22"/>
+              </w:rPr>
+              <w:t>JannPi10</w:t>
+            </w:r>
+          </w:p>
+        </w:tc>
+      </w:tr>
+      <w:tr>
+        <w:tc>
+          <w:tcPr>
+            <w:tcW w:type="dxa" w:w="3168"/>
+            <w:shd w:fill="B7B7B7"/>
+            <w:tcMar>
+              <w:top w:w="120" w:type="dxa"/>
+              <w:bottom w:w="120" w:type="dxa"/>
+              <w:left w:w="150" w:type="dxa"/>
+              <w:right w:w="150" w:type="dxa"/>
+            </w:tcMar>
+          </w:tcPr>
+          <w:p>
+            <w:pPr>
+              <w:spacing w:line="276" w:lineRule="auto"/>
+            </w:pPr>
+            <w:r>
+              <w:rPr>
+                <w:rFonts w:ascii="Times New Roman" w:hAnsi="Times New Roman"/>
+                <w:b/>
+                <w:color w:val="000000"/>
+                <w:sz w:val="22"/>
+              </w:rPr>
+              <w:t>ESTADO DEL CONTROL DE VERSIONES:</w:t>
+            </w:r>
+          </w:p>
+        </w:tc>
+        <w:tc>
+          <w:tcPr>
+            <w:tcW w:type="dxa" w:w="6192"/>
+            <w:tcMar>
+              <w:top w:w="120" w:type="dxa"/>
+              <w:bottom w:w="120" w:type="dxa"/>
+              <w:left w:w="150" w:type="dxa"/>
+              <w:right w:w="150" w:type="dxa"/>
+            </w:tcMar>
+          </w:tcPr>
+          <w:p>
+            <w:pPr>
+              <w:spacing w:line="276" w:lineRule="auto"/>
+            </w:pPr>
+            <w:r>
+              <w:rPr>
+                <w:rFonts w:ascii="Times New Roman" w:hAnsi="Times New Roman"/>
+                <w:b w:val="0"/>
+                <w:color w:val="000000"/>
+                <w:sz w:val="22"/>
+              </w:rPr>
+              <w:t>El proyecto ha sido versionado y subido modulo por modulo siguiendo estandares de desarrollo profesional (Conventional Commits). Cada modulo fue probado de manera aislada antes de ser integrado al flujo principal.</w:t>
+            </w:r>
+          </w:p>
+        </w:tc>
+      </w:tr>
+      <w:tr>
+        <w:tc>
+          <w:tcPr>
+            <w:tcW w:type="dxa" w:w="3168"/>
+            <w:shd w:fill="B7B7B7"/>
+            <w:tcMar>
+              <w:top w:w="120" w:type="dxa"/>
+              <w:bottom w:w="120" w:type="dxa"/>
+              <w:left w:w="150" w:type="dxa"/>
+              <w:right w:w="150" w:type="dxa"/>
+            </w:tcMar>
+          </w:tcPr>
+          <w:p>
+            <w:pPr>
+              <w:spacing w:line="276" w:lineRule="auto"/>
+            </w:pPr>
+            <w:r>
+              <w:rPr>
+                <w:rFonts w:ascii="Times New Roman" w:hAnsi="Times New Roman"/>
+                <w:b/>
+                <w:color w:val="000000"/>
+                <w:sz w:val="22"/>
+              </w:rPr>
+              <w:t>MODULOS Y COMMITS REGISTRADOS:</w:t>
+            </w:r>
+          </w:p>
+        </w:tc>
+        <w:tc>
+          <w:tcPr>
+            <w:tcW w:type="dxa" w:w="6192"/>
+            <w:tcMar>
+              <w:top w:w="120" w:type="dxa"/>
+              <w:bottom w:w="120" w:type="dxa"/>
+              <w:left w:w="150" w:type="dxa"/>
+              <w:right w:w="150" w:type="dxa"/>
+            </w:tcMar>
+          </w:tcPr>
+          <w:p>
+            <w:pPr>
+              <w:spacing w:line="276" w:lineRule="auto"/>
+            </w:pPr>
+            <w:r>
+              <w:rPr>
+                <w:rFonts w:ascii="Times New Roman" w:hAnsi="Times New Roman"/>
+                <w:b w:val="0"/>
+                <w:color w:val="000000"/>
+                <w:sz w:val="22"/>
+              </w:rPr>
+              <w:t>1. feat(core): inicializar repositorio, documentacion base y constantes del sistema</w:t>
+              <w:br/>
+              <w:t>2. feat(validaciones): modulo de validacion defensiva de entradas por teclado</w:t>
+              <w:br/>
+              <w:t>3. feat(data): capa de persistencia en memoria y colecciones de datos</w:t>
+              <w:br/>
+              <w:t>4. feat(auth): modulo de autenticacion, control de sesion y registro</w:t>
+              <w:br/>
+              <w:t>5. feat(servicios): catalogo, publicacion, busqueda y edicion de servicios</w:t>
+              <w:br/>
+              <w:t>6. feat(contratos): cotizacion con IVA y ciclo de vida de contratos</w:t>
+              <w:br/>
+              <w:t>7. feat(calificaciones): valoraciones y actualizacion de reputacion</w:t>
+              <w:br/>
+              <w:t>8. feat(admin): panel de administracion, metricas globales y auditoria</w:t>
+              <w:br/>
+              <w:t>9. feat(cli): menus interactivos por rol y punto de entrada de la aplicacion</w:t>
+              <w:br/>
+              <w:t>10. docs: incorporar informe academico de entrega y evidencias de ejecucion</w:t>
+            </w:r>
+          </w:p>
+        </w:tc>
+      </w:tr>
+    </w:tbl>
+    <w:p>
+      <w:pPr>
+        <w:spacing w:line="360" w:lineRule="auto" w:after="0"/>
+      </w:pPr>
+    </w:p>
+    <w:p>
+      <w:pPr>
+        <w:spacing w:after="120" w:line="360" w:lineRule="auto"/>
+        <w:jc w:val="left"/>
+      </w:pPr>
+      <w:r>
+        <w:rPr>
+          <w:rFonts w:ascii="Times New Roman" w:hAnsi="Times New Roman"/>
+          <w:b w:val="0"/>
+          <w:color w:val="000000"/>
+          <w:sz w:val="24"/>
+        </w:rPr>
+        <w:t>El codigo fuente completo, la documentacion tecnica, las guias y el historial detallado de commits se encuentran disponibles para su consulta y clonacion en el enlace oficial de GitHub: https://github.com/JannPi10/YPRI.git</w:t>
+      </w:r>
+    </w:p>
     <w:sectPr>
       <w:pgSz w:w="12240" w:h="15840"/>
       <w:pgMar w:top="1440" w:right="1440" w:bottom="1440" w:left="1440" w:header="720" w:footer="720" w:gutter="0"/>

</xml_diff>